<commit_message>
docs(healthbench): Hard 1000 보고서에서 "권장 다음 작업" 섹션 제거
- HTML/Word 양쪽에서 11번 섹션(권장 액션 4건) 삭제
- 보고서는 분석 결과 자체만 남기고, 후속 액션은 별도 작업 관리로 분리

Co-Authored-By: Claude Opus 4.7 (1M context) <noreply@anthropic.com>
</commit_message>
<xml_diff>
--- a/reports/healthbench_hard_1000_analysis.docx
+++ b/reports/healthbench_hard_1000_analysis.docx
@@ -11142,82 +11142,6 @@
       </w:r>
       <w:r>
         <w:t xml:space="preserve">SKIX 의 Hard subset 점수 (23.67) 는 GPT-4o-mini 수준. accuracy + completeness 보강으로 GPT-4o (~38) 까지 격차 ~15점 좁힐 수 있을 것 — 두 axis 가 현재 약점에 집중되어 있어 ROI 큼.</w:t>
-      </w:r>
-    </w:p>
-    <w:p>
-      <w:pPr>
-        <w:pStyle w:val="Heading2"/>
-      </w:pPr>
-      <w:r>
-        <w:rPr>
-          <w:b/>
-          <w:bCs/>
-        </w:rPr>
-        <w:t xml:space="preserve">11. 권장 다음 작업</w:t>
-      </w:r>
-    </w:p>
-    <w:p>
-      <w:pPr>
-        <w:pStyle w:val="ListParagraph"/>
-        <w:numPr>
-          <w:ilvl w:val="0"/>
-          <w:numId w:val="2"/>
-        </w:numPr>
-      </w:pPr>
-      <w:r>
-        <w:rPr>
-          <w:sz w:val="22"/>
-          <w:szCs w:val="22"/>
-        </w:rPr>
-        <w:t xml:space="preserve">0점 시나리오 178건의 음수 항목 카탈로그화 — completeness 음수 항목을 일반 패턴으로 분류 (예: "follow-up 권유 누락", "specific drug list 누락" 등)</w:t>
-      </w:r>
-    </w:p>
-    <w:p>
-      <w:pPr>
-        <w:pStyle w:val="ListParagraph"/>
-        <w:numPr>
-          <w:ilvl w:val="0"/>
-          <w:numId w:val="2"/>
-        </w:numPr>
-      </w:pPr>
-      <w:r>
-        <w:rPr>
-          <w:sz w:val="22"/>
-          <w:szCs w:val="22"/>
-        </w:rPr>
-        <w:t xml:space="preserve">Theme × Axis 매트릭스 기반 prompt 개선 — complex_responses 와 context_seeking 의 instruction_following 부분</w:t>
-      </w:r>
-    </w:p>
-    <w:p>
-      <w:pPr>
-        <w:pStyle w:val="ListParagraph"/>
-        <w:numPr>
-          <w:ilvl w:val="0"/>
-          <w:numId w:val="2"/>
-        </w:numPr>
-      </w:pPr>
-      <w:r>
-        <w:rPr>
-          <w:sz w:val="22"/>
-          <w:szCs w:val="22"/>
-        </w:rPr>
-        <w:t xml:space="preserve">SKIX guideline 보강 — 가장 자주 met 되는 음수 항목 (omission) 을 negative list 로 작성</w:t>
-      </w:r>
-    </w:p>
-    <w:p>
-      <w:pPr>
-        <w:pStyle w:val="ListParagraph"/>
-        <w:numPr>
-          <w:ilvl w:val="0"/>
-          <w:numId w:val="2"/>
-        </w:numPr>
-      </w:pPr>
-      <w:r>
-        <w:rPr>
-          <w:sz w:val="22"/>
-          <w:szCs w:val="22"/>
-        </w:rPr>
-        <w:t xml:space="preserve">Phase 3 확장 (선택) — Consensus 3,671건 import + batch 실행 후 본 분석과 cross-check</w:t>
       </w:r>
     </w:p>
     <w:p>
@@ -11457,12 +11381,6 @@
   </w:abstractNum>
   <w:num w:numId="1">
     <w:abstractNumId w:val="1"/>
-    <w:lvlOverride w:ilvl="0">
-      <w:startOverride w:val="1"/>
-    </w:lvlOverride>
-  </w:num>
-  <w:num w:numId="2">
-    <w:abstractNumId w:val="2"/>
     <w:lvlOverride w:ilvl="0">
       <w:startOverride w:val="1"/>
     </w:lvlOverride>

</xml_diff>